<commit_message>
Expand grid workspace and add symmetry mode
</commit_message>
<xml_diff>
--- a/图形小实验室_使用说明.docx
+++ b/图形小实验室_使用说明.docx
@@ -157,7 +157,7 @@
           <w:color w:val="6F7B91"/>
           <w:sz w:val="20"/>
         </w:rPr>
-        <w:t>版本 1.0  ·  2026年09月03日</w:t>
+        <w:t>版本 1.0  ·  2026年09月04日</w:t>
       </w:r>
     </w:p>
     <w:p>
@@ -1155,7 +1155,7 @@
                 <w:color w:val="263454"/>
                 <w:sz w:val="19"/>
               </w:rPr>
-              <w:t>选择横轴/竖轴和位置</w:t>
+              <w:t>选择中间横轴/竖轴</w:t>
             </w:r>
           </w:p>
         </w:tc>
@@ -1183,7 +1183,7 @@
                 <w:color w:val="263454"/>
                 <w:sz w:val="19"/>
               </w:rPr>
-              <w:t>点格点修改对称轴</w:t>
+              <w:t>在一侧点格点画图</w:t>
             </w:r>
           </w:p>
         </w:tc>
@@ -1211,7 +1211,7 @@
                 <w:color w:val="263454"/>
                 <w:sz w:val="19"/>
               </w:rPr>
-              <w:t>绿色虚线为对称轴</w:t>
+              <w:t>另一侧实时显示镜像</w:t>
             </w:r>
           </w:p>
         </w:tc>
@@ -1567,7 +1567,7 @@
           <w:color w:val="263454"/>
           <w:sz w:val="22"/>
         </w:rPr>
-        <w:t>选择“竖轴”或“横轴”。</w:t>
+        <w:t>选择“中间竖轴”或“中间横轴”，对称轴固定在格子图正中间。</w:t>
       </w:r>
     </w:p>
     <w:p>
@@ -1587,7 +1587,7 @@
           <w:color w:val="263454"/>
           <w:sz w:val="22"/>
         </w:rPr>
-        <w:t>在“轴位置”中输入格线位置，或点击“当前是第 X 格轴”后再点格子图定位。</w:t>
+        <w:t>在对称轴左/右或上/下的一侧画图，另一侧会实时显示镜像。</w:t>
       </w:r>
     </w:p>
     <w:p>
@@ -1607,7 +1607,7 @@
           <w:color w:val="263454"/>
           <w:sz w:val="22"/>
         </w:rPr>
-        <w:t>绿色虚线就是对称轴；彩色图形会显示在轴的另一侧。</w:t>
+        <w:t>可以打开或关闭“显示对称图形”，只观察原图或同时比较两侧图形。</w:t>
       </w:r>
     </w:p>
     <w:p>
@@ -1712,7 +1712,7 @@
           <w:color w:val="263454"/>
           <w:sz w:val="22"/>
         </w:rPr>
-        <w:t>打开预设后仍然可以继续修改角度、旋转中心、轴位置或叠加下一步操作。</w:t>
+        <w:t>打开预设后仍然可以继续修改角度、旋转中心，或叠加下一步操作。轴对称会始终使用格子图正中间的轴。</w:t>
       </w:r>
     </w:p>
     <w:p>

</xml_diff>